<commit_message>
jszz v1.0：备课 MCP 工具集
- B站：WBI 搜索 / 字幕 / 音视频下载
- 学科网：搜索 / 详情 / 预览页正文（SVG 文字）/ 组卷网
- 生成：学案与试卷 docx、16:9 新授课与讲评课件、组卷
- 控制台：登录态、依赖自检、产物下载
- jszz.skill：SKILL.md + 6 篇排版规范（来自 745 份真实教师资料统计）
</commit_message>
<xml_diff>
--- a/examples/preview/sample_paper.docx
+++ b/examples/preview/sample_paper.docx
@@ -5,17 +5,17 @@
     <w:p>
       <w:pPr>
         <w:keepNext w:val="0"/>
-        <w:spacing w:before="0" w:after="40" w:line="276" w:lineRule="auto"/>
+        <w:spacing w:before="0" w:after="40" w:line="288" w:lineRule="auto"/>
         <w:jc w:val="center"/>
       </w:pPr>
       <w:r>
         <w:rPr>
           <w:rFonts w:ascii="Times New Roman" w:hAnsi="Times New Roman" w:eastAsia="华文中宋"/>
           <w:b/>
-          <w:sz w:val="36"/>
+          <w:sz w:val="32"/>
           <w:u w:val="none"/>
         </w:rPr>
-        <w:t>胶州四中高三级部物理学科单元达标评测题</w:t>
+        <w:t>胶州四中高三级部物理学科单元达标评测题　2026.10</w:t>
       </w:r>
     </w:p>
     <w:p>
@@ -32,7 +32,7 @@
           <w:sz w:val="21"/>
           <w:u w:val="none"/>
         </w:rPr>
-        <w:t>（时间：90分钟 | 满分：100分）</w:t>
+        <w:t>（时间：90分钟　满分：100分）</w:t>
       </w:r>
     </w:p>
     <w:tbl>
@@ -43,16 +43,16 @@
         <w:tblLayout w:type="fixed"/>
       </w:tblPr>
       <w:tblGrid>
-        <w:gridCol w:w="1928"/>
-        <w:gridCol w:w="1928"/>
-        <w:gridCol w:w="1928"/>
-        <w:gridCol w:w="1928"/>
-        <w:gridCol w:w="1928"/>
+        <w:gridCol w:w="1973"/>
+        <w:gridCol w:w="1973"/>
+        <w:gridCol w:w="1973"/>
+        <w:gridCol w:w="1973"/>
+        <w:gridCol w:w="1973"/>
       </w:tblGrid>
       <w:tr>
         <w:tc>
           <w:tcPr>
-            <w:tcW w:type="dxa" w:w="2891"/>
+            <w:tcW w:type="dxa" w:w="2960"/>
             <w:tcBorders>
               <w:bottom w:val="single" w:sz="6" w:color="808080"/>
             </w:tcBorders>
@@ -74,7 +74,7 @@
         </w:tc>
         <w:tc>
           <w:tcPr>
-            <w:tcW w:type="dxa" w:w="482"/>
+            <w:tcW w:type="dxa" w:w="335"/>
           </w:tcPr>
           <w:p>
             <w:pPr>
@@ -84,7 +84,7 @@
         </w:tc>
         <w:tc>
           <w:tcPr>
-            <w:tcW w:type="dxa" w:w="2506"/>
+            <w:tcW w:type="dxa" w:w="2960"/>
             <w:tcBorders>
               <w:bottom w:val="single" w:sz="6" w:color="808080"/>
             </w:tcBorders>
@@ -106,7 +106,7 @@
         </w:tc>
         <w:tc>
           <w:tcPr>
-            <w:tcW w:type="dxa" w:w="482"/>
+            <w:tcW w:type="dxa" w:w="335"/>
           </w:tcPr>
           <w:p>
             <w:pPr>
@@ -116,7 +116,7 @@
         </w:tc>
         <w:tc>
           <w:tcPr>
-            <w:tcW w:type="dxa" w:w="3277"/>
+            <w:tcW w:type="dxa" w:w="2960"/>
             <w:tcBorders>
               <w:bottom w:val="single" w:sz="6" w:color="808080"/>
             </w:tcBorders>
@@ -147,7 +147,7 @@
       <w:pPr>
         <w:pStyle w:val="Heading2"/>
         <w:keepNext/>
-        <w:spacing w:before="240" w:after="80" w:line="288" w:lineRule="auto"/>
+        <w:spacing w:before="200" w:after="80" w:line="300" w:lineRule="auto"/>
       </w:pPr>
       <w:r>
         <w:rPr>
@@ -156,20 +156,20 @@
           <w:sz w:val="24"/>
           <w:u w:val="none"/>
         </w:rPr>
-        <w:t>注意事项</w:t>
+        <w:t>【注意事项】</w:t>
       </w:r>
     </w:p>
     <w:p>
       <w:pPr>
         <w:keepNext w:val="0"/>
-        <w:spacing w:before="0" w:after="60" w:line="360" w:lineRule="auto"/>
-        <w:ind w:left="420" w:hanging="420"/>
+        <w:spacing w:before="0" w:after="60" w:line="348" w:lineRule="auto"/>
+        <w:ind w:left="408" w:hanging="408"/>
       </w:pPr>
       <w:r>
         <w:rPr>
           <w:rFonts w:ascii="Times New Roman" w:hAnsi="Times New Roman" w:eastAsia="宋体"/>
           <w:b w:val="0"/>
-          <w:sz w:val="24"/>
+          <w:sz w:val="23"/>
           <w:u w:val="none"/>
         </w:rPr>
         <w:t>1. 答卷前，考生务必将自己的姓名、准考证号填写在答题卡上。</w:t>
@@ -178,14 +178,14 @@
     <w:p>
       <w:pPr>
         <w:keepNext w:val="0"/>
-        <w:spacing w:before="0" w:after="60" w:line="360" w:lineRule="auto"/>
-        <w:ind w:left="420" w:hanging="420"/>
+        <w:spacing w:before="0" w:after="60" w:line="348" w:lineRule="auto"/>
+        <w:ind w:left="408" w:hanging="408"/>
       </w:pPr>
       <w:r>
         <w:rPr>
           <w:rFonts w:ascii="Times New Roman" w:hAnsi="Times New Roman" w:eastAsia="宋体"/>
           <w:b w:val="0"/>
-          <w:sz w:val="24"/>
+          <w:sz w:val="23"/>
           <w:u w:val="none"/>
         </w:rPr>
         <w:t>2. 回答选择题时，选出每小题答案后，用铅笔把答题卡上对应题目的答案标号涂黑。</w:t>
@@ -194,14 +194,14 @@
     <w:p>
       <w:pPr>
         <w:keepNext w:val="0"/>
-        <w:spacing w:before="0" w:after="60" w:line="360" w:lineRule="auto"/>
-        <w:ind w:left="420" w:hanging="420"/>
+        <w:spacing w:before="0" w:after="60" w:line="348" w:lineRule="auto"/>
+        <w:ind w:left="408" w:hanging="408"/>
       </w:pPr>
       <w:r>
         <w:rPr>
           <w:rFonts w:ascii="Times New Roman" w:hAnsi="Times New Roman" w:eastAsia="宋体"/>
           <w:b w:val="0"/>
-          <w:sz w:val="24"/>
+          <w:sz w:val="23"/>
           <w:u w:val="none"/>
         </w:rPr>
         <w:t>3. 考试结束后，将本试卷和答题卡一并交回。</w:t>
@@ -211,7 +211,7 @@
       <w:pPr>
         <w:pStyle w:val="Heading2"/>
         <w:keepNext/>
-        <w:spacing w:before="240" w:after="80" w:line="288" w:lineRule="auto"/>
+        <w:spacing w:before="200" w:after="80" w:line="300" w:lineRule="auto"/>
       </w:pPr>
       <w:r>
         <w:rPr>
@@ -220,23 +220,23 @@
           <w:sz w:val="24"/>
           <w:u w:val="none"/>
         </w:rPr>
-        <w:t>一、单项选择题：本题共8小题，每小题3分，共24分</w:t>
+        <w:t>【一、单项选择题：本题共8小题，每小题3分，共24分】</w:t>
       </w:r>
     </w:p>
     <w:p>
       <w:pPr>
         <w:keepNext w:val="0"/>
-        <w:spacing w:before="0" w:after="60" w:line="360" w:lineRule="auto"/>
-        <w:ind w:left="420" w:hanging="420"/>
+        <w:spacing w:before="0" w:after="60" w:line="348" w:lineRule="auto"/>
+        <w:ind w:left="408" w:hanging="408"/>
       </w:pPr>
       <w:r>
         <w:rPr>
           <w:rFonts w:ascii="Times New Roman" w:hAnsi="Times New Roman" w:eastAsia="宋体"/>
           <w:b w:val="0"/>
-          <w:sz w:val="24"/>
+          <w:sz w:val="23"/>
           <w:u w:val="none"/>
         </w:rPr>
-        <w:t>1. 关于匀变速直线运动，下列说法正确的是（　　）</w:t>
+        <w:t>1. 关于匀变速直线运动，下列说法正确的是 （  ）</w:t>
       </w:r>
     </w:p>
     <w:tbl>
@@ -247,13 +247,13 @@
         <w:tblLayout w:type="fixed"/>
       </w:tblPr>
       <w:tblGrid>
-        <w:gridCol w:w="4819"/>
-        <w:gridCol w:w="4819"/>
+        <w:gridCol w:w="4933"/>
+        <w:gridCol w:w="4933"/>
       </w:tblGrid>
       <w:tr>
         <w:tc>
           <w:tcPr>
-            <w:tcW w:type="dxa" w:w="4819"/>
+            <w:tcW w:type="dxa" w:w="4933"/>
           </w:tcPr>
           <w:p>
             <w:pPr>
@@ -272,7 +272,7 @@
         </w:tc>
         <w:tc>
           <w:tcPr>
-            <w:tcW w:type="dxa" w:w="4819"/>
+            <w:tcW w:type="dxa" w:w="4933"/>
           </w:tcPr>
           <w:p>
             <w:pPr>
@@ -293,7 +293,7 @@
       <w:tr>
         <w:tc>
           <w:tcPr>
-            <w:tcW w:type="dxa" w:w="4819"/>
+            <w:tcW w:type="dxa" w:w="4933"/>
           </w:tcPr>
           <w:p>
             <w:pPr>
@@ -312,7 +312,7 @@
         </w:tc>
         <w:tc>
           <w:tcPr>
-            <w:tcW w:type="dxa" w:w="4819"/>
+            <w:tcW w:type="dxa" w:w="4933"/>
           </w:tcPr>
           <w:p>
             <w:pPr>
@@ -339,17 +339,17 @@
     <w:p>
       <w:pPr>
         <w:keepNext w:val="0"/>
-        <w:spacing w:before="0" w:after="60" w:line="360" w:lineRule="auto"/>
-        <w:ind w:left="420" w:hanging="420"/>
+        <w:spacing w:before="0" w:after="60" w:line="348" w:lineRule="auto"/>
+        <w:ind w:left="408" w:hanging="408"/>
       </w:pPr>
       <w:r>
         <w:rPr>
           <w:rFonts w:ascii="Times New Roman" w:hAnsi="Times New Roman" w:eastAsia="宋体"/>
           <w:b w:val="0"/>
-          <w:sz w:val="24"/>
+          <w:sz w:val="23"/>
           <w:u w:val="none"/>
         </w:rPr>
-        <w:t>2. 物体做初速度为零的匀加速直线运动，第1 s内、第2 s内、第3 s内的位移之比为（　　）</w:t>
+        <w:t>2. 物体做初速度为零的匀加速直线运动，第1 s内、第2 s内、第3 s内的位移之比为 （  ）</w:t>
       </w:r>
     </w:p>
     <w:tbl>
@@ -360,15 +360,15 @@
         <w:tblLayout w:type="fixed"/>
       </w:tblPr>
       <w:tblGrid>
-        <w:gridCol w:w="2409"/>
-        <w:gridCol w:w="2409"/>
-        <w:gridCol w:w="2409"/>
-        <w:gridCol w:w="2409"/>
+        <w:gridCol w:w="2466"/>
+        <w:gridCol w:w="2466"/>
+        <w:gridCol w:w="2466"/>
+        <w:gridCol w:w="2466"/>
       </w:tblGrid>
       <w:tr>
         <w:tc>
           <w:tcPr>
-            <w:tcW w:type="dxa" w:w="2409"/>
+            <w:tcW w:type="dxa" w:w="2466"/>
           </w:tcPr>
           <w:p>
             <w:pPr>
@@ -387,7 +387,7 @@
         </w:tc>
         <w:tc>
           <w:tcPr>
-            <w:tcW w:type="dxa" w:w="2409"/>
+            <w:tcW w:type="dxa" w:w="2466"/>
           </w:tcPr>
           <w:p>
             <w:pPr>
@@ -406,7 +406,7 @@
         </w:tc>
         <w:tc>
           <w:tcPr>
-            <w:tcW w:type="dxa" w:w="2409"/>
+            <w:tcW w:type="dxa" w:w="2466"/>
           </w:tcPr>
           <w:p>
             <w:pPr>
@@ -425,7 +425,7 @@
         </w:tc>
         <w:tc>
           <w:tcPr>
-            <w:tcW w:type="dxa" w:w="2409"/>
+            <w:tcW w:type="dxa" w:w="2466"/>
           </w:tcPr>
           <w:p>
             <w:pPr>
@@ -452,17 +452,17 @@
     <w:p>
       <w:pPr>
         <w:keepNext w:val="0"/>
-        <w:spacing w:before="0" w:after="60" w:line="360" w:lineRule="auto"/>
-        <w:ind w:left="420" w:hanging="420"/>
+        <w:spacing w:before="0" w:after="60" w:line="348" w:lineRule="auto"/>
+        <w:ind w:left="408" w:hanging="408"/>
       </w:pPr>
       <w:r>
         <w:rPr>
           <w:rFonts w:ascii="Times New Roman" w:hAnsi="Times New Roman" w:eastAsia="宋体"/>
           <w:b w:val="0"/>
-          <w:sz w:val="24"/>
+          <w:sz w:val="23"/>
           <w:u w:val="none"/>
         </w:rPr>
-        <w:t>3. 汽车以20 m/s的速度行驶，刹车后做匀减速直线运动，加速度大小为5 m/s²，则刹车后6 s内的位移为（　　）</w:t>
+        <w:t>3. 汽车以20 m/s的速度行驶，刹车后做匀减速直线运动，加速度大小为5 m/s²，则刹车后6 s内的位移为 （  ）</w:t>
       </w:r>
     </w:p>
     <w:tbl>
@@ -473,15 +473,15 @@
         <w:tblLayout w:type="fixed"/>
       </w:tblPr>
       <w:tblGrid>
-        <w:gridCol w:w="2409"/>
-        <w:gridCol w:w="2409"/>
-        <w:gridCol w:w="2409"/>
-        <w:gridCol w:w="2409"/>
+        <w:gridCol w:w="2466"/>
+        <w:gridCol w:w="2466"/>
+        <w:gridCol w:w="2466"/>
+        <w:gridCol w:w="2466"/>
       </w:tblGrid>
       <w:tr>
         <w:tc>
           <w:tcPr>
-            <w:tcW w:type="dxa" w:w="2409"/>
+            <w:tcW w:type="dxa" w:w="2466"/>
           </w:tcPr>
           <w:p>
             <w:pPr>
@@ -500,7 +500,7 @@
         </w:tc>
         <w:tc>
           <w:tcPr>
-            <w:tcW w:type="dxa" w:w="2409"/>
+            <w:tcW w:type="dxa" w:w="2466"/>
           </w:tcPr>
           <w:p>
             <w:pPr>
@@ -519,7 +519,7 @@
         </w:tc>
         <w:tc>
           <w:tcPr>
-            <w:tcW w:type="dxa" w:w="2409"/>
+            <w:tcW w:type="dxa" w:w="2466"/>
           </w:tcPr>
           <w:p>
             <w:pPr>
@@ -538,7 +538,7 @@
         </w:tc>
         <w:tc>
           <w:tcPr>
-            <w:tcW w:type="dxa" w:w="2409"/>
+            <w:tcW w:type="dxa" w:w="2466"/>
           </w:tcPr>
           <w:p>
             <w:pPr>
@@ -566,7 +566,7 @@
       <w:pPr>
         <w:pStyle w:val="Heading2"/>
         <w:keepNext/>
-        <w:spacing w:before="240" w:after="80" w:line="288" w:lineRule="auto"/>
+        <w:spacing w:before="200" w:after="80" w:line="300" w:lineRule="auto"/>
       </w:pPr>
       <w:r>
         <w:rPr>
@@ -575,23 +575,23 @@
           <w:sz w:val="24"/>
           <w:u w:val="none"/>
         </w:rPr>
-        <w:t>二、多项选择题：本题共4小题，每小题4分，共16分</w:t>
+        <w:t>【二、多项选择题：本题共4小题，每小题4分，共16分】</w:t>
       </w:r>
     </w:p>
     <w:p>
       <w:pPr>
         <w:keepNext w:val="0"/>
-        <w:spacing w:before="0" w:after="60" w:line="360" w:lineRule="auto"/>
-        <w:ind w:left="420" w:hanging="420"/>
+        <w:spacing w:before="0" w:after="60" w:line="348" w:lineRule="auto"/>
+        <w:ind w:left="408" w:hanging="408"/>
       </w:pPr>
       <w:r>
         <w:rPr>
           <w:rFonts w:ascii="Times New Roman" w:hAnsi="Times New Roman" w:eastAsia="宋体"/>
           <w:b w:val="0"/>
-          <w:sz w:val="24"/>
+          <w:sz w:val="23"/>
           <w:u w:val="none"/>
         </w:rPr>
-        <w:t>4. 甲、乙两物体从同一地点沿同一方向做直线运动，其v-t图像如图，下列说法正确的是（　　）</w:t>
+        <w:t>4. 甲、乙两物体从同一地点沿同一方向做直线运动，其v-t图像如图，下列说法正确的是 （  ）</w:t>
       </w:r>
     </w:p>
     <w:tbl>
@@ -602,15 +602,13 @@
         <w:tblLayout w:type="fixed"/>
       </w:tblPr>
       <w:tblGrid>
-        <w:gridCol w:w="2409"/>
-        <w:gridCol w:w="2409"/>
-        <w:gridCol w:w="2409"/>
-        <w:gridCol w:w="2409"/>
+        <w:gridCol w:w="4933"/>
+        <w:gridCol w:w="4933"/>
       </w:tblGrid>
       <w:tr>
         <w:tc>
           <w:tcPr>
-            <w:tcW w:type="dxa" w:w="2409"/>
+            <w:tcW w:type="dxa" w:w="4933"/>
           </w:tcPr>
           <w:p>
             <w:pPr>
@@ -629,7 +627,7 @@
         </w:tc>
         <w:tc>
           <w:tcPr>
-            <w:tcW w:type="dxa" w:w="2409"/>
+            <w:tcW w:type="dxa" w:w="4933"/>
           </w:tcPr>
           <w:p>
             <w:pPr>
@@ -646,9 +644,11 @@
             </w:r>
           </w:p>
         </w:tc>
+      </w:tr>
+      <w:tr>
         <w:tc>
           <w:tcPr>
-            <w:tcW w:type="dxa" w:w="2409"/>
+            <w:tcW w:type="dxa" w:w="4933"/>
           </w:tcPr>
           <w:p>
             <w:pPr>
@@ -667,7 +667,7 @@
         </w:tc>
         <w:tc>
           <w:tcPr>
-            <w:tcW w:type="dxa" w:w="2409"/>
+            <w:tcW w:type="dxa" w:w="4933"/>
           </w:tcPr>
           <w:p>
             <w:pPr>
@@ -694,17 +694,17 @@
     <w:p>
       <w:pPr>
         <w:keepNext w:val="0"/>
-        <w:spacing w:before="0" w:after="60" w:line="360" w:lineRule="auto"/>
-        <w:ind w:left="420" w:hanging="420"/>
+        <w:spacing w:before="0" w:after="60" w:line="348" w:lineRule="auto"/>
+        <w:ind w:left="408" w:hanging="408"/>
       </w:pPr>
       <w:r>
         <w:rPr>
           <w:rFonts w:ascii="Times New Roman" w:hAnsi="Times New Roman" w:eastAsia="宋体"/>
           <w:b w:val="0"/>
-          <w:sz w:val="24"/>
+          <w:sz w:val="23"/>
           <w:u w:val="none"/>
         </w:rPr>
-        <w:t>5. 关于自由落体运动，下列说法正确的是（　　）</w:t>
+        <w:t>5. 关于自由落体运动，下列说法正确的是 （  ）</w:t>
       </w:r>
     </w:p>
     <w:tbl>
@@ -715,13 +715,13 @@
         <w:tblLayout w:type="fixed"/>
       </w:tblPr>
       <w:tblGrid>
-        <w:gridCol w:w="4819"/>
-        <w:gridCol w:w="4819"/>
+        <w:gridCol w:w="4933"/>
+        <w:gridCol w:w="4933"/>
       </w:tblGrid>
       <w:tr>
         <w:tc>
           <w:tcPr>
-            <w:tcW w:type="dxa" w:w="4819"/>
+            <w:tcW w:type="dxa" w:w="4933"/>
           </w:tcPr>
           <w:p>
             <w:pPr>
@@ -740,7 +740,7 @@
         </w:tc>
         <w:tc>
           <w:tcPr>
-            <w:tcW w:type="dxa" w:w="4819"/>
+            <w:tcW w:type="dxa" w:w="4933"/>
           </w:tcPr>
           <w:p>
             <w:pPr>
@@ -761,7 +761,7 @@
       <w:tr>
         <w:tc>
           <w:tcPr>
-            <w:tcW w:type="dxa" w:w="4819"/>
+            <w:tcW w:type="dxa" w:w="4933"/>
           </w:tcPr>
           <w:p>
             <w:pPr>
@@ -780,7 +780,7 @@
         </w:tc>
         <w:tc>
           <w:tcPr>
-            <w:tcW w:type="dxa" w:w="4819"/>
+            <w:tcW w:type="dxa" w:w="4933"/>
           </w:tcPr>
           <w:p>
             <w:pPr>
@@ -808,7 +808,7 @@
       <w:pPr>
         <w:pStyle w:val="Heading2"/>
         <w:keepNext/>
-        <w:spacing w:before="240" w:after="80" w:line="288" w:lineRule="auto"/>
+        <w:spacing w:before="200" w:after="80" w:line="300" w:lineRule="auto"/>
       </w:pPr>
       <w:r>
         <w:rPr>
@@ -817,23 +817,23 @@
           <w:sz w:val="24"/>
           <w:u w:val="none"/>
         </w:rPr>
-        <w:t>三、非选择题：本题共4小题，共60分</w:t>
+        <w:t>【三、非选择题：本题共4小题，共60分】</w:t>
       </w:r>
     </w:p>
     <w:p>
       <w:pPr>
         <w:keepNext w:val="0"/>
-        <w:spacing w:before="0" w:after="60" w:line="360" w:lineRule="auto"/>
-        <w:ind w:left="420" w:hanging="420"/>
+        <w:spacing w:before="0" w:after="60" w:line="348" w:lineRule="auto"/>
+        <w:ind w:left="408" w:hanging="408"/>
       </w:pPr>
       <w:r>
         <w:rPr>
           <w:rFonts w:ascii="Times New Roman" w:hAnsi="Times New Roman" w:eastAsia="宋体"/>
           <w:b w:val="0"/>
-          <w:sz w:val="24"/>
+          <w:sz w:val="23"/>
           <w:u w:val="none"/>
         </w:rPr>
-        <w:t>6. （12分）一物体从静止开始做匀加速直线运动，加速度a=2 m/s²。求：</w:t>
+        <w:t>6. （12分）一物体从静止开始做匀加速直线运动，加速度a=2 m/s²。求：</w:t>
       </w:r>
     </w:p>
     <w:p>
@@ -887,17 +887,17 @@
     <w:p>
       <w:pPr>
         <w:keepNext w:val="0"/>
-        <w:spacing w:before="0" w:after="60" w:line="360" w:lineRule="auto"/>
-        <w:ind w:left="420" w:hanging="420"/>
+        <w:spacing w:before="0" w:after="60" w:line="348" w:lineRule="auto"/>
+        <w:ind w:left="408" w:hanging="408"/>
       </w:pPr>
       <w:r>
         <w:rPr>
           <w:rFonts w:ascii="Times New Roman" w:hAnsi="Times New Roman" w:eastAsia="宋体"/>
           <w:b w:val="0"/>
-          <w:sz w:val="24"/>
+          <w:sz w:val="23"/>
           <w:u w:val="none"/>
         </w:rPr>
-        <w:t>7. （14分）汽车以v0=20 m/s的速度匀速行驶，司机发现前方障碍后经0.5 s反应时间开始刹车，刹车加速度大小为5 m/s²。求：</w:t>
+        <w:t>7. （14分）汽车以v0=20 m/s的速度匀速行驶，司机发现前方障碍后经0.5 s反应时间开始刹车，刹车加速度大小为5 m/s²。求：</w:t>
       </w:r>
     </w:p>
     <w:p>
@@ -1041,17 +1041,43 @@
     <w:p>
       <w:pPr>
         <w:keepNext w:val="0"/>
-        <w:spacing w:before="0" w:after="60" w:line="360" w:lineRule="auto"/>
-        <w:ind w:left="420" w:hanging="420"/>
+        <w:spacing w:before="0" w:after="40" w:line="360" w:lineRule="auto"/>
+        <w:ind w:left="312"/>
+        <w:shd w:val="clear" w:color="auto" w:fill="F4F5F7"/>
+        <w:pBdr>
+          <w:left w:val="single" w:sz="12" w:space="6" w:color="9AA3AD"/>
+        </w:pBdr>
       </w:pPr>
       <w:r>
         <w:rPr>
           <w:rFonts w:ascii="Times New Roman" w:hAnsi="Times New Roman" w:eastAsia="宋体"/>
           <w:b w:val="0"/>
+          <w:color w:val="8A1B1B"/>
           <w:sz w:val="22"/>
           <w:u w:val="none"/>
         </w:rPr>
-        <w:t>6. （1）v=at=6 m/s；（2）x=½at²=16 m；（3）第4 s内位移=x4−x3=16−9=7 m。</w:t>
+        <w:t>【解析】4. 由 v-t 图像斜率可知甲做匀加速、乙做匀减速；t=2 s 时两图线相交表示速度相同，不是相遇；0~4 s 内乙的图线面积更大，位移更大。</w:t>
+      </w:r>
+    </w:p>
+    <w:p>
+      <w:pPr>
+        <w:keepNext w:val="0"/>
+        <w:spacing w:before="0" w:after="40" w:line="360" w:lineRule="auto"/>
+        <w:ind w:left="312"/>
+        <w:shd w:val="clear" w:color="auto" w:fill="F4F5F7"/>
+        <w:pBdr>
+          <w:left w:val="single" w:sz="12" w:space="6" w:color="9AA3AD"/>
+        </w:pBdr>
+      </w:pPr>
+      <w:r>
+        <w:rPr>
+          <w:rFonts w:ascii="Times New Roman" w:hAnsi="Times New Roman" w:eastAsia="宋体"/>
+          <w:b w:val="0"/>
+          <w:color w:val="8A1B1B"/>
+          <w:sz w:val="22"/>
+          <w:u w:val="none"/>
+        </w:rPr>
+        <w:t>【解析】5. 自由落体是初速度为零、只受重力的匀加速直线运动；同一地点 g 相同；位移与时间的平方成正比，不是与时间成正比。</w:t>
       </w:r>
     </w:p>
     <w:p>
@@ -1067,13 +1093,29 @@
           <w:sz w:val="22"/>
           <w:u w:val="none"/>
         </w:rPr>
-        <w:t>7. （1）反应时间0.5 s，刹车时间t=v0/a=4 s，总时间4.5 s；（2）反应距离10 m，刹车距离40 m，总距离50 m。</w:t>
+        <w:t>6. （1）v=at=6 m/s；（2）x=½at²=16 m；（3）第4 s内位移=x4−x3=16−9=7 m。</w:t>
+      </w:r>
+    </w:p>
+    <w:p>
+      <w:pPr>
+        <w:keepNext w:val="0"/>
+        <w:spacing w:before="0" w:after="60" w:line="360" w:lineRule="auto"/>
+        <w:ind w:left="420" w:hanging="420"/>
+      </w:pPr>
+      <w:r>
+        <w:rPr>
+          <w:rFonts w:ascii="Times New Roman" w:hAnsi="Times New Roman" w:eastAsia="宋体"/>
+          <w:b w:val="0"/>
+          <w:sz w:val="22"/>
+          <w:u w:val="none"/>
+        </w:rPr>
+        <w:t>7. （1）反应时间0.5 s，刹车时间t=v0/a=4 s，总时间4.5 s；（2）反应距离10 m，刹车距离40 m，总距离50 m。</w:t>
       </w:r>
     </w:p>
     <w:sectPr>
       <w:footerReference w:type="default" r:id="rId9"/>
       <w:pgSz w:w="11906" w:h="16838"/>
-      <w:pgMar w:top="1247" w:right="1134" w:bottom="1134" w:left="1134" w:header="720" w:footer="720" w:gutter="0"/>
+      <w:pgMar w:top="1134" w:right="1020" w:bottom="1077" w:left="1020" w:header="720" w:footer="720" w:gutter="0"/>
       <w:cols w:space="720"/>
       <w:docGrid w:linePitch="360"/>
     </w:sectPr>
@@ -1087,7 +1129,7 @@
     <w:pPr>
       <w:pStyle w:val="Footer"/>
       <w:spacing w:after="0"/>
-      <w:jc w:val="left"/>
+      <w:jc w:val="center"/>
     </w:pPr>
     <w:r>
       <w:rPr>
@@ -1097,14 +1139,8 @@
         <w:sz w:val="18"/>
         <w:u w:val="none"/>
       </w:rPr>
-      <w:t>胶州四中</w:t>
+      <w:t xml:space="preserve">胶州四中高三级部物理学科单元达标评测题　　</w:t>
     </w:r>
-  </w:p>
-  <w:p>
-    <w:pPr>
-      <w:spacing w:after="0"/>
-      <w:jc w:val="right"/>
-    </w:pPr>
     <w:r>
       <w:rPr>
         <w:rFonts w:ascii="Times New Roman" w:hAnsi="Times New Roman" w:eastAsia="宋体"/>
@@ -1135,7 +1171,7 @@
         <w:sz w:val="18"/>
         <w:u w:val="none"/>
       </w:rPr>
-      <w:t xml:space="preserve"> 页　共 </w:t>
+      <w:t xml:space="preserve"> 页（共 </w:t>
     </w:r>
     <w:r>
       <w:rPr>
@@ -1157,7 +1193,7 @@
         <w:sz w:val="18"/>
         <w:u w:val="none"/>
       </w:rPr>
-      <w:t xml:space="preserve"> 页</w:t>
+      <w:t xml:space="preserve"> 页）</w:t>
     </w:r>
   </w:p>
 </w:ftr>

</xml_diff>